<commit_message>
docs: criando e alterando documentos Sprint 3
</commit_message>
<xml_diff>
--- a/docs/Backlog_Priorizado_Mente_Fria.docx
+++ b/docs/Backlog_Priorizado_Mente_Fria.docx
@@ -8,6 +8,11 @@
       </w:pPr>
       <w:r>
         <w:t xml:space="preserve">BACKLOG PRIORIZADO — MENTE FRIA</w:t>
+      </w:r>
+    </w:p>
+    <w:p>
+      <w:r>
+        <w:t xml:space="preserve">Atualizado em 27/10/2026 conforme o Adendo nº 1 ao Termo de Aceite, aprovado nessa data (lucro estimado, reposição com orçamento, dashboard, alertas, publicação e a nova US27). Na coluna Sprint alvo, "A → B" indica a sprint planejada antes e a atual.</w:t>
       </w:r>
     </w:p>
     <w:tbl>
@@ -541,7 +546,7 @@
               <w:jc w:val="left"/>
             </w:pPr>
             <w:r>
-              <w:t xml:space="preserve">Como proprietário, quero cadastrar e atualizar o preço de venda de cada produto, para que o sistema use esse valor nos cálculos de receita.</w:t>
+              <w:t xml:space="preserve">Como proprietário, quero cadastrar e atualizar o preço de venda de cada produto, para que o sistema use esse valor nos cálculos de receita e de lucro estimado.</w:t>
             </w:r>
           </w:p>
         </w:tc>
@@ -775,19 +780,19 @@
               <w:jc w:val="left"/>
             </w:pPr>
             <w:r>
-              <w:t xml:space="preserve">Como proprietário e funcionário, quero registrar a entrada de ingredientes no estoque e saída de produtos, para que a quantidade disponível fique sempre atualizada.</w:t>
-            </w:r>
-          </w:p>
-        </w:tc>
-        <w:tc>
-          <w:tcPr/>
-          <w:p>
-            <w:pPr>
-              <w:pStyle w:val="Compact"/>
-              <w:jc w:val="left"/>
-            </w:pPr>
-            <w:r>
-              <w:t xml:space="preserve">Toda movimentação gera registro com data, tipo (entrada/saída) e quantidade Quantidade em estoque não pode ficar negativa Estoque atualizado em tempo real após o registro</w:t>
+              <w:t xml:space="preserve">Como proprietário e funcionário, quero registrar a entrada de ingredientes no estoque e a baixa de ingredientes (saída convencional ou descarte de vencidos), para que a quantidade disponível fique sempre atualizada.</w:t>
+            </w:r>
+          </w:p>
+        </w:tc>
+        <w:tc>
+          <w:tcPr/>
+          <w:p>
+            <w:pPr>
+              <w:pStyle w:val="Compact"/>
+              <w:jc w:val="left"/>
+            </w:pPr>
+            <w:r>
+              <w:t xml:space="preserve">Toda movimentação gera registro com data, tipo (entrada/saída) e quantidade Quantidade em estoque não pode ficar negativa Estoque atualizado em tempo real após o registro Cada entrada forma uma linha de estoque com sua validade; a baixa consome primeiro a validade mais próxima e nunca usa estoque vencido Toda saída informa o motivo: saída convencional ou descarte de vencidos</w:t>
             </w:r>
           </w:p>
         </w:tc>
@@ -823,7 +828,7 @@
               <w:jc w:val="left"/>
             </w:pPr>
             <w:r>
-              <w:t xml:space="preserve">Sprint 2</w:t>
+              <w:t xml:space="preserve">Sprint 2 → Sprint 3</w:t>
             </w:r>
           </w:p>
         </w:tc>
@@ -853,19 +858,19 @@
               <w:jc w:val="left"/>
             </w:pPr>
             <w:r>
-              <w:t xml:space="preserve">Como proprietário, quero que o sistema calcule automaticamente a quantidade recomendada de cada produto para maximizar a receita com o estoque disponível, para que eu não precise fazer esse cálculo manualmente.</w:t>
-            </w:r>
-          </w:p>
-        </w:tc>
-        <w:tc>
-          <w:tcPr/>
-          <w:p>
-            <w:pPr>
-              <w:pStyle w:val="Compact"/>
-              <w:jc w:val="left"/>
-            </w:pPr>
-            <w:r>
-              <w:t xml:space="preserve">Cálculo usa Programação Linear Inteira pura considerando estoque de ingredientes, composição dos produtos e preço de venda Resultado respeita os limites de ingredientes disponíveis Recomendação é recalculada a partir de um trigger dado pelo proprietário.</w:t>
+              <w:t xml:space="preserve">Como proprietário, quero que o sistema calcule automaticamente a quantidade recomendada de cada produto para maximizar o lucro estimado com o estoque válido disponível, para que eu não precise fazer esse cálculo manualmente.</w:t>
+            </w:r>
+          </w:p>
+        </w:tc>
+        <w:tc>
+          <w:tcPr/>
+          <w:p>
+            <w:pPr>
+              <w:pStyle w:val="Compact"/>
+              <w:jc w:val="left"/>
+            </w:pPr>
+            <w:r>
+              <w:t xml:space="preserve">Cálculo usa Programação Linear Inteira pura considerando o estoque válido (não vencido) de ingredientes, a composição dos produtos, o preço de venda e o custo dos ingredientes Lucro estimado por copo = preço de venda − custo dos ingredientes da composição (mão de obra, aluguel, impostos, taxas e perdas não entram; Adendo nº 1, item 1) Resultado respeita os limites de ingredientes disponíveis Recomendação é recalculada a partir de um trigger dado pelo proprietário.</w:t>
             </w:r>
           </w:p>
         </w:tc>
@@ -901,7 +906,7 @@
               <w:jc w:val="left"/>
             </w:pPr>
             <w:r>
-              <w:t xml:space="preserve">Sprint 2</w:t>
+              <w:t xml:space="preserve">Sprint 2 → Sprint 3</w:t>
             </w:r>
           </w:p>
         </w:tc>
@@ -943,7 +948,7 @@
               <w:jc w:val="left"/>
             </w:pPr>
             <w:r>
-              <w:t xml:space="preserve">Exibe quantidade recomendada por produto e a receita estimada final Não exibe termos técnicos de otimização</w:t>
+              <w:t xml:space="preserve">Exibe quantidade recomendada por produto, o lucro potencial e a receita estimada final Explica o zero: "Sem lucro" ou "Falta ingrediente" Não exibe termos técnicos de otimização</w:t>
             </w:r>
           </w:p>
         </w:tc>
@@ -979,7 +984,7 @@
               <w:jc w:val="left"/>
             </w:pPr>
             <w:r>
-              <w:t xml:space="preserve">Sprint 2</w:t>
+              <w:t xml:space="preserve">Sprint 2 → Sprint 3</w:t>
             </w:r>
           </w:p>
         </w:tc>
@@ -1057,7 +1062,7 @@
               <w:jc w:val="left"/>
             </w:pPr>
             <w:r>
-              <w:t xml:space="preserve">Sprint 2</w:t>
+              <w:t xml:space="preserve">Sprint 2 → Sprint 3</w:t>
             </w:r>
           </w:p>
         </w:tc>
@@ -1135,7 +1140,7 @@
               <w:jc w:val="left"/>
             </w:pPr>
             <w:r>
-              <w:t xml:space="preserve">Sprint 2</w:t>
+              <w:t xml:space="preserve">Sprint 2 → fora da Sprint 3</w:t>
             </w:r>
           </w:p>
         </w:tc>
@@ -1165,19 +1170,19 @@
               <w:jc w:val="left"/>
             </w:pPr>
             <w:r>
-              <w:t xml:space="preserve">Como proprietário ao fazer a reposição mensal do estoque quero ter recomendações para reposição.</w:t>
-            </w:r>
-          </w:p>
-        </w:tc>
-        <w:tc>
-          <w:tcPr/>
-          <w:p>
-            <w:pPr>
-              <w:pStyle w:val="Compact"/>
-              <w:jc w:val="left"/>
-            </w:pPr>
-            <w:r>
-              <w:t xml:space="preserve">Sistema calcula a quantidade recomendada de reposição com base no consumo de um período X e o preço atual dos ingredientes Ao gerar um trigger o sistema exibe as sugestões de reposição.</w:t>
+              <w:t xml:space="preserve">Como proprietário, ao fazer a reposição mensal do estoque, quero recomendações de compra dentro de um orçamento, para que eu reponha o que mais falta sem gastar além do que posso.</w:t>
+            </w:r>
+          </w:p>
+        </w:tc>
+        <w:tc>
+          <w:tcPr/>
+          <w:p>
+            <w:pPr>
+              <w:pStyle w:val="Compact"/>
+              <w:jc w:val="left"/>
+            </w:pPr>
+            <w:r>
+              <w:t xml:space="preserve">Sistema calcula a quantidade recomendada de reposição com base no consumo de um período informado (1 a 365 dias), no preço atual e no estoque válido dos ingredientes, sem passar do orçamento informado Se o orçamento não cobre nem os mínimos, mostra os mínimos e quanto falta Ao gerar um trigger o sistema exibe as sugestões de reposição Nada é comprado automaticamente (Adendo nº 1, item 2)</w:t>
             </w:r>
           </w:p>
         </w:tc>
@@ -1213,7 +1218,7 @@
               <w:jc w:val="left"/>
             </w:pPr>
             <w:r>
-              <w:t xml:space="preserve">Sprint 2</w:t>
+              <w:t xml:space="preserve">Sprint 2 → Sprint 3</w:t>
             </w:r>
           </w:p>
         </w:tc>
@@ -1255,7 +1260,7 @@
               <w:jc w:val="left"/>
             </w:pPr>
             <w:r>
-              <w:t xml:space="preserve">Sistema identifica a quantidade mínima do ingrediente em estoque e compara com a quantidade atual e exibe um alerta em nível de interface caso necessário Não gera pedido automático ao fornecedor (fora de escopo)</w:t>
+              <w:t xml:space="preserve">Sistema identifica a quantidade mínima do ingrediente em estoque e compara com a quantidade atual e exibe um alerta em nível de interface caso necessário Não gera pedido automático ao fornecedor (fora de escopo) Neste semestre, atendido pelo selo "Abaixo do mínimo" na tela de estoque (com o estoque válido) e pela contagem no dashboard (Adendo nº 1, item 4)</w:t>
             </w:r>
           </w:p>
         </w:tc>
@@ -1291,7 +1296,7 @@
               <w:jc w:val="left"/>
             </w:pPr>
             <w:r>
-              <w:t xml:space="preserve">Sprint 3</w:t>
+              <w:t xml:space="preserve">Sprint 3 (parcial: Adendo nº 1, item 4); história dedicada depois</w:t>
             </w:r>
           </w:p>
         </w:tc>
@@ -1333,7 +1338,7 @@
               <w:jc w:val="left"/>
             </w:pPr>
             <w:r>
-              <w:t xml:space="preserve">Alerta exibido quando faltarem X dias para o vencimento (parametrizável) Destaca itens já vencidos separadamente Considera a data atual do servidor Considera apenas movimentações de estoque do tipo ENTRADA com data_validade preenchida — movimentações de SAIDA não possuem validade própria e são ignoradas pelo alerta</w:t>
+              <w:t xml:space="preserve">Alerta exibido quando faltarem X dias para o vencimento (parametrizável) Destaca itens já vencidos separadamente Considera a data atual do servidor Considera apenas movimentações de estoque do tipo ENTRADA com data_validade preenchida — movimentações de SAIDA não possuem validade própria e são ignoradas pelo alerta Neste semestre, aviso fixo de 7 dias ("Vence em breve") e vencidos destacados como "Vencida" na tela de estoque, com contagem no dashboard (Adendo nº 1, item 4)</w:t>
             </w:r>
           </w:p>
         </w:tc>
@@ -1369,7 +1374,7 @@
               <w:jc w:val="left"/>
             </w:pPr>
             <w:r>
-              <w:t xml:space="preserve">Sprint 3</w:t>
+              <w:t xml:space="preserve">Sprint 3 (parcial: Adendo nº 1, item 4); prazo ajustável depois</w:t>
             </w:r>
           </w:p>
         </w:tc>
@@ -1411,7 +1416,7 @@
               <w:jc w:val="left"/>
             </w:pPr>
             <w:r>
-              <w:t xml:space="preserve">Consulta agregada com GROUP BY produto/ingrediente/pedidos Une dados de Produtos, Ingredientes, Pedidos e Estoque Atualiza conforme novos dados são cadastrados</w:t>
+              <w:t xml:space="preserve">Consulta agregada com GROUP BY produto/ingrediente/pedidos Une dados de Produtos, Ingredientes, Pedidos e Estoque Atualiza conforme novos dados são cadastrados Mostra a receita máxima estimada e os produtos prioritários do último cálculo de produção e a situação do estoque Considera só pedidos ativos Ingredientes mais utilizados ordenados pelo custo do consumo Ranking por usuário e filtros são adicionais (Adendo nº 1, item 3)</w:t>
             </w:r>
           </w:p>
         </w:tc>
@@ -1603,7 +1608,7 @@
               <w:jc w:val="left"/>
             </w:pPr>
             <w:r>
-              <w:t xml:space="preserve">Sprint 3</w:t>
+              <w:t xml:space="preserve">Sprint 3 → fora da Sprint 3</w:t>
             </w:r>
           </w:p>
         </w:tc>
@@ -1645,7 +1650,7 @@
               <w:jc w:val="left"/>
             </w:pPr>
             <w:r>
-              <w:t xml:space="preserve">Ambiente acessível publicamente via HTTPS Deploy validado</w:t>
+              <w:t xml:space="preserve">Ambiente acessível publicamente via HTTPS Deploy validado Disponível até 30/11/2026, com backup do banco e restauração testada Otimização no servidor só com licença autorizada pela Gurobi; sem ela, a otimização é demonstrada localmente (Adendo nº 1, item 5)</w:t>
             </w:r>
           </w:p>
         </w:tc>
@@ -1681,7 +1686,7 @@
               <w:jc w:val="left"/>
             </w:pPr>
             <w:r>
-              <w:t xml:space="preserve">Sprint 4</w:t>
+              <w:t xml:space="preserve">Sprint 4 → Sprint 3</w:t>
             </w:r>
           </w:p>
         </w:tc>
@@ -2149,7 +2154,85 @@
               <w:jc w:val="left"/>
             </w:pPr>
             <w:r>
-              <w:t xml:space="preserve">Sprint 3</w:t>
+              <w:t xml:space="preserve">Sprint 3 → fora da Sprint 3</w:t>
+            </w:r>
+          </w:p>
+        </w:tc>
+      </w:tr>
+      <w:tr>
+        <w:tc>
+          <w:tcPr/>
+          <w:p>
+            <w:pPr>
+              <w:pStyle w:val="Compact"/>
+              <w:jc w:val="left"/>
+            </w:pPr>
+            <w:r>
+              <w:rPr>
+                <w:bCs/>
+                <w:b/>
+              </w:rPr>
+              <w:t xml:space="preserve">27</w:t>
+            </w:r>
+          </w:p>
+        </w:tc>
+        <w:tc>
+          <w:tcPr/>
+          <w:p>
+            <w:pPr>
+              <w:pStyle w:val="Compact"/>
+              <w:jc w:val="left"/>
+            </w:pPr>
+            <w:r>
+              <w:t xml:space="preserve">Como proprietário e funcionário, quero cancelar um pedido registrado por engano, para que ele não conte no faturamento nem no dashboard.</w:t>
+            </w:r>
+          </w:p>
+        </w:tc>
+        <w:tc>
+          <w:tcPr/>
+          <w:p>
+            <w:pPr>
+              <w:pStyle w:val="Compact"/>
+              <w:jc w:val="left"/>
+            </w:pPr>
+            <w:r>
+              <w:t xml:space="preserve">O pedido cancelado fica registrado, com a data e quem cancelou O cancelamento não devolve os ingredientes ao estoque Pedido cancelado não entra no faturamento, nos mais vendidos nem no ranking do dashboard Continua contando no consumo usado pela reposição (Adendo nº 1, item 6)</w:t>
+            </w:r>
+          </w:p>
+        </w:tc>
+        <w:tc>
+          <w:tcPr/>
+          <w:p>
+            <w:pPr>
+              <w:pStyle w:val="Compact"/>
+              <w:jc w:val="left"/>
+            </w:pPr>
+            <w:r>
+              <w:t xml:space="preserve">Could</w:t>
+            </w:r>
+          </w:p>
+        </w:tc>
+        <w:tc>
+          <w:tcPr/>
+          <w:p>
+            <w:pPr>
+              <w:pStyle w:val="Compact"/>
+              <w:jc w:val="left"/>
+            </w:pPr>
+            <w:r>
+              <w:t xml:space="preserve">—</w:t>
+            </w:r>
+          </w:p>
+        </w:tc>
+        <w:tc>
+          <w:tcPr/>
+          <w:p>
+            <w:pPr>
+              <w:pStyle w:val="Compact"/>
+              <w:jc w:val="left"/>
+            </w:pPr>
+            <w:r>
+              <w:t xml:space="preserve">Fora da Sprint 3 (história nova, Adendo nº 1)</w:t>
             </w:r>
           </w:p>
         </w:tc>

</xml_diff>

<commit_message>
docs: atualizar documentação da Sprint 4
</commit_message>
<xml_diff>
--- a/docs/Backlog_Priorizado_Mente_Fria.docx
+++ b/docs/Backlog_Priorizado_Mente_Fria.docx
@@ -13,6 +13,11 @@
     <w:p>
       <w:r>
         <w:t xml:space="preserve">Atualizado em 27/10/2026 conforme o Adendo nº 1 ao Termo de Aceite, aprovado nessa data (lucro estimado, reposição com orçamento, dashboard, alertas, publicação e a nova US27). Na coluna Sprint alvo, "A → B" indica a sprint planejada antes e a atual.</w:t>
+      </w:r>
+    </w:p>
+    <w:p>
+      <w:r>
+        <w:t xml:space="preserve">Atualizado em 28/10/2026 conforme o cronograma do professor: o escopo do Adendo nº 1 é entregue na Sprint 4, em 06/11/2026; "fora do semestre" quer dizer que não há sprint de desenvolvimento depois dessa data, só uma semana de correção de bugs (decisões A39 e A40).</w:t>
       </w:r>
     </w:p>
     <w:tbl>
@@ -204,7 +209,7 @@
               <w:jc w:val="left"/>
             </w:pPr>
             <w:r>
-              <w:t xml:space="preserve">Sprint 1</w:t>
+              <w:t xml:space="preserve">Sprint 1 → Sprint 4</w:t>
             </w:r>
           </w:p>
         </w:tc>
@@ -282,7 +287,7 @@
               <w:jc w:val="left"/>
             </w:pPr>
             <w:r>
-              <w:t xml:space="preserve">Sprint 1</w:t>
+              <w:t xml:space="preserve">Sprint 1 → Sprint 4</w:t>
             </w:r>
           </w:p>
         </w:tc>
@@ -360,7 +365,7 @@
               <w:jc w:val="left"/>
             </w:pPr>
             <w:r>
-              <w:t xml:space="preserve">Sprint 1</w:t>
+              <w:t xml:space="preserve">Sprint 1 → Sprint 4</w:t>
             </w:r>
           </w:p>
         </w:tc>
@@ -438,7 +443,7 @@
               <w:jc w:val="left"/>
             </w:pPr>
             <w:r>
-              <w:t xml:space="preserve">Sprint 1</w:t>
+              <w:t xml:space="preserve">Sprint 1 → Sprint 4</w:t>
             </w:r>
           </w:p>
         </w:tc>
@@ -516,7 +521,7 @@
               <w:jc w:val="left"/>
             </w:pPr>
             <w:r>
-              <w:t xml:space="preserve">Sprint 1</w:t>
+              <w:t xml:space="preserve">Sprint 1 → Sprint 4</w:t>
             </w:r>
           </w:p>
         </w:tc>
@@ -594,7 +599,7 @@
               <w:jc w:val="left"/>
             </w:pPr>
             <w:r>
-              <w:t xml:space="preserve">Sprint 1</w:t>
+              <w:t xml:space="preserve">Sprint 1 → Sprint 4</w:t>
             </w:r>
           </w:p>
         </w:tc>
@@ -672,7 +677,7 @@
               <w:jc w:val="left"/>
             </w:pPr>
             <w:r>
-              <w:t xml:space="preserve">Sprint 1</w:t>
+              <w:t xml:space="preserve">Sprint 1 → Sprint 4</w:t>
             </w:r>
           </w:p>
         </w:tc>
@@ -828,7 +833,7 @@
               <w:jc w:val="left"/>
             </w:pPr>
             <w:r>
-              <w:t xml:space="preserve">Sprint 2 → Sprint 3</w:t>
+              <w:t xml:space="preserve">Sprint 2 → Sprint 4 (planejada na Sprint 3)</w:t>
             </w:r>
           </w:p>
         </w:tc>
@@ -906,7 +911,7 @@
               <w:jc w:val="left"/>
             </w:pPr>
             <w:r>
-              <w:t xml:space="preserve">Sprint 2 → Sprint 3</w:t>
+              <w:t xml:space="preserve">Sprint 2 → Sprint 4 (planejada na Sprint 3)</w:t>
             </w:r>
           </w:p>
         </w:tc>
@@ -984,7 +989,7 @@
               <w:jc w:val="left"/>
             </w:pPr>
             <w:r>
-              <w:t xml:space="preserve">Sprint 2 → Sprint 3</w:t>
+              <w:t xml:space="preserve">Sprint 2 → Sprint 4 (planejada na Sprint 3)</w:t>
             </w:r>
           </w:p>
         </w:tc>
@@ -1062,7 +1067,7 @@
               <w:jc w:val="left"/>
             </w:pPr>
             <w:r>
-              <w:t xml:space="preserve">Sprint 2 → Sprint 3</w:t>
+              <w:t xml:space="preserve">Sprint 2 → Sprint 4 (planejada na Sprint 3)</w:t>
             </w:r>
           </w:p>
         </w:tc>
@@ -1140,7 +1145,7 @@
               <w:jc w:val="left"/>
             </w:pPr>
             <w:r>
-              <w:t xml:space="preserve">Sprint 2 → fora da Sprint 3</w:t>
+              <w:t xml:space="preserve">Sprint 2 → fora do semestre</w:t>
             </w:r>
           </w:p>
         </w:tc>
@@ -1218,7 +1223,7 @@
               <w:jc w:val="left"/>
             </w:pPr>
             <w:r>
-              <w:t xml:space="preserve">Sprint 2 → Sprint 3</w:t>
+              <w:t xml:space="preserve">Sprint 2 → Sprint 4 (planejada na Sprint 3)</w:t>
             </w:r>
           </w:p>
         </w:tc>
@@ -1296,7 +1301,7 @@
               <w:jc w:val="left"/>
             </w:pPr>
             <w:r>
-              <w:t xml:space="preserve">Sprint 3 (parcial: Adendo nº 1, item 4); história dedicada depois</w:t>
+              <w:t xml:space="preserve">Sprint 4 (parcial: Adendo nº 1, item 4); versão completa fora do semestre</w:t>
             </w:r>
           </w:p>
         </w:tc>
@@ -1374,7 +1379,7 @@
               <w:jc w:val="left"/>
             </w:pPr>
             <w:r>
-              <w:t xml:space="preserve">Sprint 3 (parcial: Adendo nº 1, item 4); prazo ajustável depois</w:t>
+              <w:t xml:space="preserve">Sprint 4 (parcial: Adendo nº 1, item 4); prazo ajustável fora do semestre</w:t>
             </w:r>
           </w:p>
         </w:tc>
@@ -1452,7 +1457,7 @@
               <w:jc w:val="left"/>
             </w:pPr>
             <w:r>
-              <w:t xml:space="preserve">Sprint 3</w:t>
+              <w:t xml:space="preserve">Sprint 3 → Sprint 4</w:t>
             </w:r>
           </w:p>
         </w:tc>
@@ -1530,7 +1535,7 @@
               <w:jc w:val="left"/>
             </w:pPr>
             <w:r>
-              <w:t xml:space="preserve">Sprint 3</w:t>
+              <w:t xml:space="preserve">Sprint 3 → Sprint 4</w:t>
             </w:r>
           </w:p>
         </w:tc>
@@ -1608,7 +1613,7 @@
               <w:jc w:val="left"/>
             </w:pPr>
             <w:r>
-              <w:t xml:space="preserve">Sprint 3 → fora da Sprint 3</w:t>
+              <w:t xml:space="preserve">Sprint 3 → fora do semestre</w:t>
             </w:r>
           </w:p>
         </w:tc>
@@ -1686,7 +1691,7 @@
               <w:jc w:val="left"/>
             </w:pPr>
             <w:r>
-              <w:t xml:space="preserve">Sprint 4 → Sprint 3</w:t>
+              <w:t xml:space="preserve">Sprint 4</w:t>
             </w:r>
           </w:p>
         </w:tc>
@@ -2154,7 +2159,7 @@
               <w:jc w:val="left"/>
             </w:pPr>
             <w:r>
-              <w:t xml:space="preserve">Sprint 3 → fora da Sprint 3</w:t>
+              <w:t xml:space="preserve">Sprint 3 → Sprint 4, condicional (A40); se não entrar até 04/11, fora do semestre</w:t>
             </w:r>
           </w:p>
         </w:tc>
@@ -2232,7 +2237,7 @@
               <w:jc w:val="left"/>
             </w:pPr>
             <w:r>
-              <w:t xml:space="preserve">Fora da Sprint 3 (história nova, Adendo nº 1)</w:t>
+              <w:t xml:space="preserve">Fora do semestre (história nova, Adendo nº 1; A40)</w:t>
             </w:r>
           </w:p>
         </w:tc>

</xml_diff>